<commit_message>
Mapeamento G4 08.10.2026: correções da segunda rodada de verificação
Co-Authored-By: Claude Opus 5.5 <noreply@anthropic.com>
Claude-Session: https://claude.ai/code/session_01BpZkacDk3pdFmbRkE5TjeH
</commit_message>
<xml_diff>
--- a/Mapeamento de Top Empresas - Aula G4 08.10.2026.docx
+++ b/Mapeamento de Top Empresas - Aula G4 08.10.2026.docx
@@ -631,7 +631,7 @@
                 <w:sz w:val="18"/>
                 <w:szCs w:val="18"/>
               </w:rPr>
-              <w:t xml:space="preserve"> A investigação apurou R$ 26 milhões em tributos sonegados em 373 picapes e estimou que o esquema inteiro poderia chegar a R$ 500 milhões, sem valor atribuído só à concessionária. Mesmo sem condenação conhecida, autos de infração, responsabilização solidária da concessionária e bloqueio de bens podem reaparecer e travar crédito.</w:t>
+              <w:t xml:space="preserve"> A investigação estimou R$ 26 milhões em tributos sonegados em 373 picapes e estimou que o esquema inteiro poderia chegar a R$ 500 milhões, sem valor atribuído só à concessionária. Mesmo sem condenação conhecida, autos de infração, responsabilização solidária da concessionária e bloqueio de bens podem reaparecer e travar crédito.</w:t>
             </w:r>
           </w:p>
           <w:p>
@@ -718,7 +718,7 @@
                 <w:sz w:val="18"/>
                 <w:szCs w:val="18"/>
               </w:rPr>
-              <w:t xml:space="preserve"> A Selic caiu só para 13,75% em setembro de 2026 e o juro médio para a pessoa física comprar veículo estava em 26,5% ao ano em julho. A parcela sobe e o custo do estoque financiado aperta a margem da concessionária.</w:t>
+              <w:t xml:space="preserve"> A Selic caiu só para 13,75% em setembro de 2026 e o juro médio para a pessoa física comprar veículo estava em 26,4% ao ano em agosto. A parcela sobe e o custo do estoque financiado aperta a margem da concessionária.</w:t>
             </w:r>
           </w:p>
           <w:p>
@@ -857,7 +857,7 @@
                 <w:sz w:val="18"/>
                 <w:szCs w:val="18"/>
               </w:rPr>
-              <w:t xml:space="preserve"> Grupos seguem comprando redes: em maio de 2026 o Grupo Vigorito anunciou a compra da Granleste, concessionária Chevrolet em São Paulo, por cerca de R$ 130 milhões. Bandeiras Chevrolet, BMW e Yamaha num mercado isolado como Manaus são ativo raro, para vender participação ou comprar concorrente.</w:t>
+              <w:t xml:space="preserve"> Grupos seguem comprando redes: em maio de 2026 o Grupo Vigorito acertava a compra da Granleste, concessionária Chevrolet em São Paulo, por cerca de R$ 130 milhões. Bandeiras Chevrolet, BMW e Yamaha num mercado isolado como Manaus são ativo raro, para vender participação ou comprar concorrente.</w:t>
             </w:r>
           </w:p>
           <w:p>
@@ -1274,7 +1274,7 @@
                 <w:sz w:val="18"/>
                 <w:szCs w:val="18"/>
               </w:rPr>
-              <w:t>Fundada em fevereiro de 2019 por Erika Chaves, ex-professora de Anatomia Patológica em cursos de medicina da UGF e da Estácio. Tem duas sócias e opera em unidade única na Avenida Embaixador Abelardo Bueno. Declara mais de 50 turmas formadas, carga prática acima de 80% e mais de 13 mil pacientes atendidos.</w:t>
+              <w:t>Fundada em fevereiro de 2019 por Erika Chaves, que se apresenta como ex-professora de Anatomia Patológica em cursos de medicina da UGF e da Estácio. Tem duas sócias e opera em unidade única na Avenida Embaixador Abelardo Bueno. Declara mais de 50 turmas formadas, carga prática acima de 80% e mais de 13 mil pacientes atendidos.</w:t>
             </w:r>
           </w:p>
         </w:tc>
@@ -1560,7 +1560,7 @@
                 <w:sz w:val="18"/>
                 <w:szCs w:val="18"/>
               </w:rPr>
-              <w:t xml:space="preserve"> Alunos não médicos aplicam injetáveis em pacientes reais. Em 2026 a Vigilância Sanitária do DF fez 125 interdições em clínicas e salões de estética e a Anvisa mandou apreender lote falsificado de toxina botulínica. Um evento adverso vira ação de indenização e fiscalização sanitária.</w:t>
+              <w:t xml:space="preserve"> Alunos não médicos aplicam injetáveis em pacientes reais. Em 2026 a Vigilância Sanitária do DF fez 125 interdições em clínicas e estabelecimentos de estética e a Anvisa mandou apreender lote falsificado de toxina botulínica. Um evento adverso vira ação de indenização e fiscalização sanitária.</w:t>
             </w:r>
           </w:p>
           <w:p>
@@ -1699,7 +1699,7 @@
                 <w:sz w:val="18"/>
                 <w:szCs w:val="18"/>
               </w:rPr>
-              <w:t xml:space="preserve"> O PL 3.268/2026 reconhece esteticistas como profissionais de saúde e teve urgência aprovada na Câmara em julho, e tramita no Senado o PL 3.698/2026, que reconhece a saúde estética como área de biomédicos, enfermeiros, farmacêuticos e fisioterapeutas. Quem acompanha o texto se antecipa ao novo currículo.</w:t>
+              <w:t xml:space="preserve"> O PL 3.268/2026 reconhece esteticistas como profissionais de saúde e teve urgência aprovada na Câmara em julho, e tramita no Senado o PL 3.698/2026, que reconhece a saúde estética como área de biomédicos, enfermeiros, farmacêuticos e fisioterapeutas, entre outros. Quem acompanha o texto se antecipa ao novo currículo.</w:t>
             </w:r>
           </w:p>
           <w:p>
@@ -1887,7 +1887,7 @@
         <w:rPr>
           <w:rFonts w:ascii="Calibri" w:hAnsi="Calibri" w:cs="Calibri"/>
         </w:rPr>
-        <w:t>R$ 350 milhões (2024)</w:t>
+        <w:t>R$ 350 milhões</w:t>
       </w:r>
     </w:p>
     <w:p>
@@ -2074,7 +2074,7 @@
                 <w:sz w:val="18"/>
                 <w:szCs w:val="18"/>
               </w:rPr>
-              <w:t>Se apresenta como a maior rede de streetwear do país. Vende tênis, roupas e acessórios de Nike, Jordan, Adidas, Vans e Puma, além de coleção própria e collabs licenciadas com Disney e Street Fighter, ao público jovem ligado ao hip hop, em lojas, e-commerce e na linha infantil Hype Kings.</w:t>
+              <w:t>Apresenta-se como a maior rede de streetwear do país. Vende tênis, roupas e acessórios de marcas como Nike, Jordan e Adidas, além de coleção própria e collabs licenciadas com Disney e Street Fighter, ao público jovem ligado ao hip hop, em lojas e e-commerce.</w:t>
             </w:r>
           </w:p>
         </w:tc>
@@ -2145,7 +2145,7 @@
                 <w:sz w:val="18"/>
                 <w:szCs w:val="18"/>
               </w:rPr>
-              <w:t>Nasceu em 2007 na Galeria do Rock, em São Paulo, com R$ 300 emprestados. Tem mais de 160 lojas, a maioria franquias. Igor Moraes divide a franqueadora com três holdings da família Djmal desde 2018. Vende nos Estados Unidos desde 2025.</w:t>
+              <w:t>Nasceu em 2007 na Galeria do Rock, em São Paulo, com R$ 300 emprestados. Tem mais de 160 lojas, a maioria franquias. Igor Moraes divide a franqueadora com três holdings de investidores desde 2018. Vende nos Estados Unidos desde 2025.</w:t>
             </w:r>
           </w:p>
         </w:tc>
@@ -2216,7 +2216,7 @@
                 <w:sz w:val="18"/>
                 <w:szCs w:val="18"/>
               </w:rPr>
-              <w:t>Out/2026 — Anuncia nova fase de expansão para cidades onde o streetwear ainda tem pouca oferta.</w:t>
+              <w:t>Out/2026 — Anuncia nova fase de expansão da rede.</w:t>
             </w:r>
           </w:p>
           <w:p>
@@ -2235,7 +2235,7 @@
                 <w:sz w:val="18"/>
                 <w:szCs w:val="18"/>
               </w:rPr>
-              <w:t>Mai/2026 — Lança collab exclusiva com a Disney sobre Toy Story, depois da coleção Carros, em abril.</w:t>
+              <w:t>Mai/2026 — Lança collab com a Disney inspirada em Toy Story, depois da coleção Carros, em abril.</w:t>
             </w:r>
           </w:p>
           <w:p>
@@ -2273,7 +2273,7 @@
                 <w:sz w:val="18"/>
                 <w:szCs w:val="18"/>
               </w:rPr>
-              <w:t>Jul/2025 — Estreia nos Estados Unidos com e-commerce e US$ 500 mil de investimento, mantido mesmo após a tarifa de 50% sobre produtos brasileiros.</w:t>
+              <w:t>Jul/2025 — Estreia nos Estados Unidos com e-commerce e US$ 500 mil de investimento, mantido mesmo após o anúncio da tarifa de 50% sobre produtos brasileiros.</w:t>
             </w:r>
           </w:p>
         </w:tc>
@@ -2354,7 +2354,7 @@
                 <w:sz w:val="18"/>
                 <w:szCs w:val="18"/>
               </w:rPr>
-              <w:t xml:space="preserve"> Desde maio de 2026, compras online de até US$ 50 em plataformas do Remessa Conforme têm imposto de importação zero, no lugar dos 20% de antes. A Lei 15.502, de setembro, consolidou a medida e autoriza reduzir de 60% para até 30% a alíquota das compras até US$ 3 mil. O jovem que compra camiseta, boné e tênis de entrada é o alvo dessas plataformas.</w:t>
+              <w:t xml:space="preserve"> Desde maio de 2026, compras online de até US$ 50 em plataformas do Remessa Conforme têm imposto de importação zero, no lugar dos 20% de antes. A Lei 15.502, de 10 de setembro, consolidou a medida e autoriza reduzir de 60% para até 30% a alíquota das compras até US$ 3 mil, que por ora segue em 60%. O jovem que compra camiseta, boné e tênis de entrada é o alvo dessas plataformas.</w:t>
             </w:r>
           </w:p>
           <w:p>
@@ -2580,7 +2580,7 @@
                 <w:sz w:val="18"/>
                 <w:szCs w:val="18"/>
               </w:rPr>
-              <w:t xml:space="preserve"> Rede líder em streetwear, com mais de 160 lojas e crescimento de 25% nas mesmas lojas em 2024. Atrai fundos e estratégicos, para vender participação ou comprar redes regionais.</w:t>
+              <w:t xml:space="preserve"> Uma das maiores redes de streetwear do país, com mais de 160 lojas e alta de 25% nas vendas em 2024. Atrai fundos e estratégicos, para vender participação ou comprar redes regionais.</w:t>
             </w:r>
           </w:p>
           <w:p>
@@ -2609,7 +2609,7 @@
                 <w:sz w:val="18"/>
                 <w:szCs w:val="18"/>
               </w:rPr>
-              <w:t xml:space="preserve"> A sobretaxa de US$ 10,22 por par vence em 2027 e a Abicalçados quer renová-la e abrir nova investigação contra Vietnã e Indonésia. Quem importa produto de marca própria pode atuar como parte interessada no processo.</w:t>
+              <w:t xml:space="preserve"> A sobretaxa de US$ 10,22 por par vence em fevereiro de 2027 e a Abicalçados quer renová-la e abrir nova investigação contra Vietnã e Indonésia. Quem importa produto de marca própria pode atuar como parte interessada no processo.</w:t>
             </w:r>
           </w:p>
           <w:p>
@@ -2884,7 +2884,7 @@
                 <w:sz w:val="18"/>
                 <w:szCs w:val="18"/>
               </w:rPr>
-              <w:t>Construção industrial por empreitada para indústria e logística. Capital fechado, controlada por sócios pessoas físicas e holdings patrimoniais.</w:t>
+              <w:t>Construção industrial por empreitada para indústria e logística. Capital fechado, controlada por sócios pessoas físicas e por duas pessoas jurídicas, entre elas uma holding patrimonial.</w:t>
             </w:r>
           </w:p>
         </w:tc>
@@ -2955,7 +2955,7 @@
                 <w:sz w:val="18"/>
                 <w:szCs w:val="18"/>
               </w:rPr>
-              <w:t>Constrói galpões, fábricas, centros de distribuição e infraestrutura industrial, da fundação à estrutura metálica, para clientes como Continental, Vipal, Grupo Petrópolis, Ardagh, São Braz e CONE. Atende também supermercados, concessionárias, clínicas e hospitais.</w:t>
+              <w:t>Constrói galpões, fábricas, centros de distribuição e infraestrutura industrial, da fundação à estrutura metálica, para clientes como Continental, Vipal, Grupo Boticário, Grupo Petrópolis, Ardagh, São Braz e CONE. Atende também supermercados, concessionárias, clínicas e hospitais.</w:t>
             </w:r>
           </w:p>
         </w:tc>
@@ -3097,7 +3097,7 @@
                 <w:sz w:val="18"/>
                 <w:szCs w:val="18"/>
               </w:rPr>
-              <w:t>2026 — Executa ampliações da Continental em Camaçari (BA), com 10 mil m² de galpão e 22,7 mil m² de pátio, e da Vipal em Feira de Santana (BA).</w:t>
+              <w:t>Out/2026 — O portfólio da empresa lista em andamento as ampliações da Continental em Camaçari (BA), com 10 mil m² de galpão e 22,7 mil m² de pátio, e da Vipal em Feira de Santana (BA), além de galpão frigorífico de 20,9 mil m² para a CONE em Cabo de Santo Agostinho (PE).</w:t>
             </w:r>
           </w:p>
           <w:p>
@@ -3116,7 +3116,7 @@
                 <w:sz w:val="18"/>
                 <w:szCs w:val="18"/>
               </w:rPr>
-              <w:t>2026 — Constrói galpão frigorífico de 20,9 mil m² para a CONE em Cabo de Santo Agostinho (PE), no polo de Suape.</w:t>
+              <w:t>Mar/2025 — A São Braz inaugura a fábrica de 19,5 mil m² construída pela BDG em Conceição do Jacuípe (BA).</w:t>
             </w:r>
           </w:p>
           <w:p>
@@ -3136,25 +3136,6 @@
                 <w:szCs w:val="18"/>
               </w:rPr>
               <w:t>Mar/2025 — Registra Francisco José Freire Alcântara (Frank) e Eduardo Duder Peixoto como administradores.</w:t>
-            </w:r>
-          </w:p>
-          <w:p>
-            <w:pPr>
-              <w:spacing w:after="20" w:line="240" w:lineRule="auto"/>
-              <w:jc w:val="both"/>
-              <w:rPr>
-                <w:rFonts w:ascii="Calibri" w:hAnsi="Calibri" w:cs="Calibri"/>
-                <w:sz w:val="18"/>
-                <w:szCs w:val="18"/>
-              </w:rPr>
-            </w:pPr>
-            <w:r>
-              <w:rPr>
-                <w:rFonts w:ascii="Calibri" w:hAnsi="Calibri" w:cs="Calibri"/>
-                <w:sz w:val="18"/>
-                <w:szCs w:val="18"/>
-              </w:rPr>
-              <w:t>2024 — Conclui a fábrica da São Braz em Conceição do Jacuípe (BA), com 19,5 mil m², inaugurada em março de 2025.</w:t>
             </w:r>
           </w:p>
           <w:p>
@@ -3254,7 +3235,7 @@
                 <w:sz w:val="18"/>
                 <w:szCs w:val="18"/>
               </w:rPr>
-              <w:t xml:space="preserve"> A Selic caiu só para 13,75% em setembro de 2026 e o juro lidera as queixas dos construtores. A CBIC cortou a projeção de crescimento da construção em 2026 de 2% para 1,2%.</w:t>
+              <w:t xml:space="preserve"> A Selic caiu só para 13,75% em setembro de 2026 e o juro lidera as queixas dos construtores. A CBIC cortou a projeção de crescimento da construção em 2026 de 2% para 1,2% em maio e a manteve em setembro.</w:t>
             </w:r>
           </w:p>
           <w:p>
@@ -3283,7 +3264,7 @@
                 <w:sz w:val="18"/>
                 <w:szCs w:val="18"/>
               </w:rPr>
-              <w:t xml:space="preserve"> A PEC que reduz a jornada para 40 horas passou na Câmara em maio de 2026, foi aprovada na CCJ do Senado em setembro e está em discussão no plenário. A CBIC estima mão de obra até 15% mais cara e obra 7% a 10% mais cara. Em contrato de preço fechado, a diferença sai da margem.</w:t>
+              <w:t xml:space="preserve"> A PEC que reduz a jornada para 40 horas passou na Câmara em maio de 2026, foi aprovada na CCJ do Senado em setembro e começou a ser discutida no plenário em 6 de outubro. A CBIC estima mão de obra até 15% mais cara e obra 7% a 10% mais cara. Em contrato de preço fechado, a diferença sai da margem.</w:t>
             </w:r>
           </w:p>
           <w:p>
@@ -3370,7 +3351,7 @@
                 <w:sz w:val="18"/>
                 <w:szCs w:val="18"/>
               </w:rPr>
-              <w:t xml:space="preserve"> Na fábrica da BYD em Camaçari, 163 trabalhadores foram resgatados em condição análoga à escravidão em dezembro de 2024 e a obra foi embargada. Construtora e dono da obra respondem por terceirizadas, alojamento e segurança (NR-18, norma de segurança em obras).</w:t>
+              <w:t xml:space="preserve"> Na fábrica da BYD em Camaçari, 163 trabalhadores foram resgatados em condição análoga à escravidão em dezembro de 2024 e alojamentos e parte da obra foram interditados. Construtora e dono da obra respondem por terceirizadas, alojamento e segurança (NR-18, norma de segurança em obras).</w:t>
             </w:r>
           </w:p>
         </w:tc>
@@ -3451,7 +3432,7 @@
                 <w:sz w:val="18"/>
                 <w:szCs w:val="18"/>
               </w:rPr>
-              <w:t xml:space="preserve"> A BYD aplicou R$ 5,5 bilhões em Camaçari e contratou mais 400 pessoas em abril de 2026. A Continental completou 20 anos na cidade em abril de 2026, depois de investir R$ 1,2 bilhão na modernização da fábrica. É carteira na porta de casa.</w:t>
+              <w:t xml:space="preserve"> A BYD aplicou R$ 5,5 bilhões em Camaçari e contratou mais 400 pessoas em abril de 2026. A Continental completou 20 anos na cidade em abril de 2026, depois de investir R$ 1,2 bilhão na fábrica em dez anos. É carteira na porta de casa.</w:t>
             </w:r>
           </w:p>
           <w:p>
@@ -3567,7 +3548,7 @@
                 <w:sz w:val="18"/>
                 <w:szCs w:val="18"/>
               </w:rPr>
-              <w:t xml:space="preserve"> Capital fechado, controlada por sócios pessoas físicas e holdings patrimoniais. Acordo de sócios, conselho consultivo, segregação de patrimônio e planejamento sucessório reduzem risco de conflito, destravam crédito mais barato e são pré-requisito para venda, captação ou entrada de sócio.</w:t>
+              <w:t xml:space="preserve"> Capital fechado, com sócios pessoas físicas e pessoas jurídicas. Acordo de sócios, conselho consultivo, segregação de patrimônio e planejamento sucessório reduzem risco de conflito, destravam crédito mais barato e são pré-requisito para venda, captação ou entrada de sócio.</w:t>
             </w:r>
           </w:p>
         </w:tc>
@@ -3897,7 +3878,7 @@
                 <w:sz w:val="18"/>
                 <w:szCs w:val="18"/>
               </w:rPr>
-              <w:t>Fundada em 1995 em Indaial como Bagatoli Comércio de Refrigeração, com capital social de R$ 4,5 milhões. Controlada por Aldivar e Maicon Bagatoli, sócios-administradores. Matriz no Vale do Itajaí e filiais abertas em 2023 e 2024 no Espírito Santo e em São Paulo, desenho típico de quem distribui para o país inteiro a partir de centros logísticos e fiscais. A família tem outras empresas na região.</w:t>
+              <w:t>Fundada em 1995 como Bagatoli Comércio de Refrigeração, teve a matriz registrada em Indaial antes de levá-la para Blumenau. Capital social de R$ 4,5 milhões. Controlada por Aldivar e Maicon Bagatoli, sócios-administradores. Matriz no Vale do Itajaí e filiais abertas em 2023 e 2024 no Espírito Santo e em São Paulo, desenho típico de quem distribui para o país inteiro a partir de centros logísticos e fiscais. A família tem outras empresas na região.</w:t>
             </w:r>
           </w:p>
         </w:tc>
@@ -3987,6 +3968,25 @@
                 <w:sz w:val="18"/>
                 <w:szCs w:val="18"/>
               </w:rPr>
+              <w:t>Fev/2025 — A Bagatoli passa a ser a sócia da Master Eletrodoméstico, varejista de Blumenau administrada por Aldivar Bagatoli.</w:t>
+            </w:r>
+          </w:p>
+          <w:p>
+            <w:pPr>
+              <w:spacing w:after="20" w:line="240" w:lineRule="auto"/>
+              <w:jc w:val="both"/>
+              <w:rPr>
+                <w:rFonts w:ascii="Calibri" w:hAnsi="Calibri" w:cs="Calibri"/>
+                <w:sz w:val="18"/>
+                <w:szCs w:val="18"/>
+              </w:rPr>
+            </w:pPr>
+            <w:r>
+              <w:rPr>
+                <w:rFonts w:ascii="Calibri" w:hAnsi="Calibri" w:cs="Calibri"/>
+                <w:sz w:val="18"/>
+                <w:szCs w:val="18"/>
+              </w:rPr>
               <w:t>Jun/2024 — Maicon Bagatoli entra no quadro societário como sócio-administrador.</w:t>
             </w:r>
           </w:p>
@@ -4135,7 +4135,7 @@
                 <w:sz w:val="18"/>
                 <w:szCs w:val="18"/>
               </w:rPr>
-              <w:t xml:space="preserve"> Medida provisória de maio de 2026, convertida em lei em setembro, zerou de forma permanente o imposto de importação de 20% nas compras internacionais online até US$ 50. Eletroportátil de entrada vendido por plataforma estrangeira volta a competir em preço.</w:t>
+              <w:t xml:space="preserve"> Medida provisória de maio de 2026, convertida em lei em setembro, zerou o imposto de importação de 20% nas compras internacionais online até US$ 50, agora sem prazo de validade, embora a alíquota fique a critério do Ministério da Fazenda. Eletroportátil de entrada vendido por plataforma estrangeira volta a competir em preço.</w:t>
             </w:r>
           </w:p>
           <w:p>
@@ -5122,7 +5122,7 @@
                 <w:sz w:val="18"/>
                 <w:szCs w:val="18"/>
               </w:rPr>
-              <w:t xml:space="preserve"> O camarão brasileiro sofre antidumping nos Estados Unidos desde 2005 e hoje o país exporta pouco. Se a oferta continuar crescendo acima do consumo, o excedente fica no mercado interno.</w:t>
+              <w:t xml:space="preserve"> O camarão brasileiro sofreu antidumping nos Estados Unidos de 2005 a 2016 e hoje o país exporta pouco, barrado também por restrições sanitárias na União Europeia. Se a oferta continuar crescendo acima do consumo, o excedente fica no mercado interno.</w:t>
             </w:r>
           </w:p>
         </w:tc>
@@ -5203,7 +5203,7 @@
                 <w:sz w:val="18"/>
                 <w:szCs w:val="18"/>
               </w:rPr>
-              <w:t xml:space="preserve"> O camarão de cativeiro movimentou R$ 3,6 bilhões no Brasil em 2025, alta de 19,4%. Sem o Equador, que respondia por mais de 40% do camarão importado, o produtor nacional ganha espaço no abastecimento.</w:t>
+              <w:t xml:space="preserve"> O camarão de cativeiro movimentou R$ 3,6 bilhões no Brasil em 2025, alta de 19,4%. Sem o Equador, que respondia por mais de 40% do camarão congelado importado, o produtor nacional ganha espaço no abastecimento.</w:t>
             </w:r>
           </w:p>
           <w:p>
@@ -5261,7 +5261,7 @@
                 <w:sz w:val="18"/>
                 <w:szCs w:val="18"/>
               </w:rPr>
-              <w:t xml:space="preserve"> Apresenta-se como pioneira no camarão orgânico sem antibiótico e dentro da indicação geográfica Costa Negra, a empresa tem diferencial de preço que concorrente de escala não copia rápido.</w:t>
+              <w:t xml:space="preserve"> A empresa se apresenta como pioneira no camarão orgânico sem antibiótico e está dentro da indicação geográfica Costa Negra, diferencial de preço que concorrente de escala não copia rápido.</w:t>
             </w:r>
           </w:p>
           <w:p>
@@ -5319,7 +5319,7 @@
                 <w:sz w:val="18"/>
                 <w:szCs w:val="18"/>
               </w:rPr>
-              <w:t xml:space="preserve"> Com 2,5 mil produtores no Ceará, a maioria pequenos, há espaço para comprar fazendas. A holding SNB, já sociedade anônima, facilita entrada de sócio financeiro ou emissão de dívida.</w:t>
+              <w:t xml:space="preserve"> Com cerca de 2,5 mil produtores no Ceará, a maioria pequenos, há espaço para comprar fazendas. A holding SNB, já sociedade anônima, facilita entrada de sócio financeiro ou emissão de dívida.</w:t>
             </w:r>
           </w:p>
           <w:p>
@@ -5749,7 +5749,7 @@
                 <w:sz w:val="18"/>
                 <w:szCs w:val="18"/>
               </w:rPr>
-              <w:t>Set/2026 — A Corrida 100% Você chega a Maceió, depois de Vitória, Rio, Brasília, Palmas, Recife e São Luís.</w:t>
+              <w:t>Set/2026 — A Corrida 100% Você chega a Maceió, depois de passar em 2026 por Fortaleza, Vitória, Rio, Brasília, Palmas, Recife e São Luís, entre outras cidades.</w:t>
             </w:r>
           </w:p>
           <w:p>
@@ -5768,7 +5768,7 @@
                 <w:sz w:val="18"/>
                 <w:szCs w:val="18"/>
               </w:rPr>
-              <w:t>Jun/2026 — Lança cinco produtos na feira Naturaltech e reafirma a meta de quadruplicar o faturamento em 2026.</w:t>
+              <w:t>Jun/2026 — Lança novos produtos na feira Naturaltech e reafirma a meta de quadruplicar o faturamento em 2026.</w:t>
             </w:r>
           </w:p>
           <w:p>
@@ -5993,7 +5993,7 @@
                 <w:sz w:val="18"/>
                 <w:szCs w:val="18"/>
               </w:rPr>
-              <w:t xml:space="preserve"> A CBS, novo tributo federal sobre consumo, passa a ser cobrada em 2027, e o IBS entra de forma gradual entre 2029 e 2033. Alimentos listados em lei têm redução de 60%, e o código fiscal do suplemento (NCM, a classificação da mercadoria) decide se ele entra nesse benefício.</w:t>
+              <w:t xml:space="preserve"> A CBS, novo tributo federal sobre consumo, passa a ser cobrada em 2027; o IBS começa simbólico, a 0,1% em 2027 e 2028, e sobe de forma gradual de 2029 a 2033. Alimentos listados em lei têm redução de 60%, e o código fiscal do suplemento (NCM, a classificação da mercadoria) decide se ele entra nesse benefício.</w:t>
             </w:r>
           </w:p>
           <w:p>
@@ -6706,7 +6706,7 @@
                 <w:sz w:val="18"/>
                 <w:szCs w:val="18"/>
               </w:rPr>
-              <w:t>2023 — Mudança para a nova sede industrial em Monte Mor e rebranding da marca.</w:t>
+              <w:t>Jun/2023 — Em entrevista, o CEO apresenta a nova sede industrial em Monte Mor e o rebranding da marca.</w:t>
             </w:r>
           </w:p>
           <w:p>
@@ -6893,7 +6893,7 @@
                 <w:sz w:val="18"/>
                 <w:szCs w:val="18"/>
               </w:rPr>
-              <w:t xml:space="preserve"> Desde julho de 2026 os Estados Unidos cobram 25% sobre a maior parte dos produtos brasileiros e mais 12,5% numa segunda medida. Óleos essenciais e perfumaria ficaram fora dos 25%, mas pagam os 12,5%, o que encarece levar fragrância da Ginger para a operação olfativa que o controlador estrutura em Miami.</w:t>
+              <w:t xml:space="preserve"> Desde julho de 2026 os Estados Unidos cobram sobretaxas de 25% e de 12,5%, em duas medidas, sobre parte dos produtos brasileiros. Óleos essenciais e perfumaria ficaram fora dos 25%, mas pagam os 12,5%, o que encarece levar fragrância da Ginger para a operação olfativa que o controlador estrutura em Miami.</w:t>
             </w:r>
           </w:p>
           <w:p>

</xml_diff>